<commit_message>
Architecture Document Updated - classes for login module specified - functions for login module specified
</commit_message>
<xml_diff>
--- a/Program/Task 1 - Login Components/Architecture.docx
+++ b/Program/Task 1 - Login Components/Architecture.docx
@@ -6,56 +6,679 @@
       <w:pPr>
         <w:spacing w:line="480" w:lineRule="auto"/>
         <w:rPr>
+          <w:rFonts w:ascii="Times New Roman" w:hAnsi="Times New Roman" w:cs="Times New Roman"/>
+        </w:rPr>
+      </w:pPr>
+      <w:r>
+        <w:rPr>
+          <w:rFonts w:ascii="Times New Roman" w:hAnsi="Times New Roman" w:cs="Times New Roman"/>
           <w:b/>
           <w:bCs/>
         </w:rPr>
-      </w:pPr>
-      <w:r>
-        <w:rPr>
+        <w:t>Classes</w:t>
+      </w:r>
+    </w:p>
+    <w:p>
+      <w:pPr>
+        <w:spacing w:line="480" w:lineRule="auto"/>
+        <w:ind w:left="720"/>
+        <w:rPr>
+          <w:rFonts w:ascii="Times New Roman" w:hAnsi="Times New Roman" w:cs="Times New Roman"/>
+          <w:sz w:val="18"/>
+          <w:szCs w:val="18"/>
+        </w:rPr>
+      </w:pPr>
+      <w:r>
+        <w:rPr>
+          <w:rFonts w:ascii="Times New Roman" w:hAnsi="Times New Roman" w:cs="Times New Roman"/>
+          <w:sz w:val="18"/>
+          <w:szCs w:val="18"/>
+        </w:rPr>
+        <w:t>Account</w:t>
+      </w:r>
+    </w:p>
+    <w:p>
+      <w:pPr>
+        <w:spacing w:line="480" w:lineRule="auto"/>
+        <w:rPr>
+          <w:rFonts w:ascii="Times New Roman" w:hAnsi="Times New Roman" w:cs="Times New Roman"/>
           <w:b/>
           <w:bCs/>
         </w:rPr>
-        <w:t>Classes</w:t>
-      </w:r>
-    </w:p>
-    <w:p>
-      <w:pPr>
-        <w:spacing w:line="480" w:lineRule="auto"/>
-        <w:rPr>
+      </w:pPr>
+      <w:r>
+        <w:rPr>
+          <w:rFonts w:ascii="Times New Roman" w:hAnsi="Times New Roman" w:cs="Times New Roman"/>
           <w:b/>
           <w:bCs/>
         </w:rPr>
-      </w:pPr>
-      <w:r>
-        <w:rPr>
+        <w:t>Class Functions</w:t>
+      </w:r>
+    </w:p>
+    <w:p>
+      <w:pPr>
+        <w:spacing w:line="480" w:lineRule="auto"/>
+        <w:ind w:left="720"/>
+        <w:rPr>
+          <w:rFonts w:ascii="Times New Roman" w:hAnsi="Times New Roman" w:cs="Times New Roman"/>
+          <w:sz w:val="18"/>
+          <w:szCs w:val="18"/>
+        </w:rPr>
+      </w:pPr>
+      <w:proofErr w:type="spellStart"/>
+      <w:r>
+        <w:rPr>
+          <w:rFonts w:ascii="Times New Roman" w:hAnsi="Times New Roman" w:cs="Times New Roman"/>
+          <w:sz w:val="18"/>
+          <w:szCs w:val="18"/>
+        </w:rPr>
+        <w:t>username_check</w:t>
+      </w:r>
+      <w:proofErr w:type="spellEnd"/>
+      <w:r>
+        <w:rPr>
+          <w:rFonts w:ascii="Times New Roman" w:hAnsi="Times New Roman" w:cs="Times New Roman"/>
+          <w:sz w:val="18"/>
+          <w:szCs w:val="18"/>
+        </w:rPr>
+        <w:t xml:space="preserve"> (</w:t>
+      </w:r>
+      <w:proofErr w:type="spellStart"/>
+      <w:r>
+        <w:rPr>
+          <w:rFonts w:ascii="Times New Roman" w:hAnsi="Times New Roman" w:cs="Times New Roman"/>
+          <w:sz w:val="18"/>
+          <w:szCs w:val="18"/>
+        </w:rPr>
+        <w:t>arg</w:t>
+      </w:r>
+      <w:proofErr w:type="spellEnd"/>
+      <w:r>
+        <w:rPr>
+          <w:rFonts w:ascii="Times New Roman" w:hAnsi="Times New Roman" w:cs="Times New Roman"/>
+          <w:sz w:val="18"/>
+          <w:szCs w:val="18"/>
+        </w:rPr>
+        <w:t xml:space="preserve">: </w:t>
+      </w:r>
+      <w:r>
+        <w:rPr>
+          <w:rFonts w:ascii="Times New Roman" w:hAnsi="Times New Roman" w:cs="Times New Roman"/>
+          <w:i/>
+          <w:iCs/>
+          <w:sz w:val="18"/>
+          <w:szCs w:val="18"/>
+        </w:rPr>
+        <w:t>username</w:t>
+      </w:r>
+      <w:r>
+        <w:rPr>
+          <w:rFonts w:ascii="Times New Roman" w:hAnsi="Times New Roman" w:cs="Times New Roman"/>
+          <w:sz w:val="18"/>
+          <w:szCs w:val="18"/>
+        </w:rPr>
+        <w:t>)</w:t>
+      </w:r>
+    </w:p>
+    <w:p>
+      <w:pPr>
+        <w:pStyle w:val="ListParagraph"/>
+        <w:numPr>
+          <w:ilvl w:val="0"/>
+          <w:numId w:val="4"/>
+        </w:numPr>
+        <w:spacing w:line="480" w:lineRule="auto"/>
+        <w:rPr>
+          <w:rFonts w:ascii="Times New Roman" w:hAnsi="Times New Roman" w:cs="Times New Roman"/>
+          <w:sz w:val="18"/>
+          <w:szCs w:val="18"/>
+        </w:rPr>
+      </w:pPr>
+      <w:r>
+        <w:rPr>
+          <w:rFonts w:ascii="Times New Roman" w:hAnsi="Times New Roman" w:cs="Times New Roman"/>
+          <w:sz w:val="18"/>
+          <w:szCs w:val="18"/>
+        </w:rPr>
+        <w:t>Checks list for existing username</w:t>
+      </w:r>
+    </w:p>
+    <w:p>
+      <w:pPr>
+        <w:spacing w:line="480" w:lineRule="auto"/>
+        <w:ind w:left="720"/>
+        <w:rPr>
+          <w:rFonts w:ascii="Times New Roman" w:hAnsi="Times New Roman" w:cs="Times New Roman"/>
+          <w:sz w:val="18"/>
+          <w:szCs w:val="18"/>
+        </w:rPr>
+      </w:pPr>
+      <w:proofErr w:type="spellStart"/>
+      <w:r>
+        <w:rPr>
+          <w:rFonts w:ascii="Times New Roman" w:hAnsi="Times New Roman" w:cs="Times New Roman"/>
+          <w:sz w:val="18"/>
+          <w:szCs w:val="18"/>
+        </w:rPr>
+        <w:t>p</w:t>
+      </w:r>
+      <w:r>
+        <w:rPr>
+          <w:rFonts w:ascii="Times New Roman" w:hAnsi="Times New Roman" w:cs="Times New Roman"/>
+          <w:sz w:val="18"/>
+          <w:szCs w:val="18"/>
+        </w:rPr>
+        <w:t>assword</w:t>
+      </w:r>
+      <w:r>
+        <w:rPr>
+          <w:rFonts w:ascii="Times New Roman" w:hAnsi="Times New Roman" w:cs="Times New Roman"/>
+          <w:sz w:val="18"/>
+          <w:szCs w:val="18"/>
+        </w:rPr>
+        <w:t>_check</w:t>
+      </w:r>
+      <w:proofErr w:type="spellEnd"/>
+      <w:r>
+        <w:rPr>
+          <w:rFonts w:ascii="Times New Roman" w:hAnsi="Times New Roman" w:cs="Times New Roman"/>
+          <w:sz w:val="18"/>
+          <w:szCs w:val="18"/>
+        </w:rPr>
+        <w:t xml:space="preserve"> (</w:t>
+      </w:r>
+      <w:proofErr w:type="spellStart"/>
+      <w:r>
+        <w:rPr>
+          <w:rFonts w:ascii="Times New Roman" w:hAnsi="Times New Roman" w:cs="Times New Roman"/>
+          <w:sz w:val="18"/>
+          <w:szCs w:val="18"/>
+        </w:rPr>
+        <w:t>arg</w:t>
+      </w:r>
+      <w:proofErr w:type="spellEnd"/>
+      <w:r>
+        <w:rPr>
+          <w:rFonts w:ascii="Times New Roman" w:hAnsi="Times New Roman" w:cs="Times New Roman"/>
+          <w:sz w:val="18"/>
+          <w:szCs w:val="18"/>
+        </w:rPr>
+        <w:t xml:space="preserve">: </w:t>
+      </w:r>
+      <w:r>
+        <w:rPr>
+          <w:rFonts w:ascii="Times New Roman" w:hAnsi="Times New Roman" w:cs="Times New Roman"/>
+          <w:i/>
+          <w:iCs/>
+          <w:sz w:val="18"/>
+          <w:szCs w:val="18"/>
+        </w:rPr>
+        <w:t>password</w:t>
+      </w:r>
+      <w:r>
+        <w:rPr>
+          <w:rFonts w:ascii="Times New Roman" w:hAnsi="Times New Roman" w:cs="Times New Roman"/>
+          <w:sz w:val="18"/>
+          <w:szCs w:val="18"/>
+        </w:rPr>
+        <w:t>)</w:t>
+      </w:r>
+    </w:p>
+    <w:p>
+      <w:pPr>
+        <w:pStyle w:val="ListParagraph"/>
+        <w:numPr>
+          <w:ilvl w:val="0"/>
+          <w:numId w:val="4"/>
+        </w:numPr>
+        <w:spacing w:line="480" w:lineRule="auto"/>
+        <w:rPr>
+          <w:rFonts w:ascii="Times New Roman" w:hAnsi="Times New Roman" w:cs="Times New Roman"/>
+          <w:sz w:val="18"/>
+          <w:szCs w:val="18"/>
+        </w:rPr>
+      </w:pPr>
+      <w:r>
+        <w:rPr>
+          <w:rFonts w:ascii="Times New Roman" w:hAnsi="Times New Roman" w:cs="Times New Roman"/>
+          <w:sz w:val="18"/>
+          <w:szCs w:val="18"/>
+        </w:rPr>
+        <w:t>Verifies min. length of 8 characters</w:t>
+      </w:r>
+    </w:p>
+    <w:p>
+      <w:pPr>
+        <w:pStyle w:val="ListParagraph"/>
+        <w:numPr>
+          <w:ilvl w:val="0"/>
+          <w:numId w:val="4"/>
+        </w:numPr>
+        <w:spacing w:line="480" w:lineRule="auto"/>
+        <w:rPr>
+          <w:rFonts w:ascii="Times New Roman" w:hAnsi="Times New Roman" w:cs="Times New Roman"/>
+          <w:sz w:val="18"/>
+          <w:szCs w:val="18"/>
+        </w:rPr>
+      </w:pPr>
+      <w:r>
+        <w:rPr>
+          <w:rFonts w:ascii="Times New Roman" w:hAnsi="Times New Roman" w:cs="Times New Roman"/>
+          <w:sz w:val="18"/>
+          <w:szCs w:val="18"/>
+        </w:rPr>
+        <w:t>Verifies max. length of 16 characters</w:t>
+      </w:r>
+    </w:p>
+    <w:p>
+      <w:pPr>
+        <w:pStyle w:val="ListParagraph"/>
+        <w:numPr>
+          <w:ilvl w:val="0"/>
+          <w:numId w:val="4"/>
+        </w:numPr>
+        <w:spacing w:line="480" w:lineRule="auto"/>
+        <w:rPr>
+          <w:rFonts w:ascii="Times New Roman" w:hAnsi="Times New Roman" w:cs="Times New Roman"/>
+          <w:sz w:val="18"/>
+          <w:szCs w:val="18"/>
+        </w:rPr>
+      </w:pPr>
+      <w:proofErr w:type="spellStart"/>
+      <w:r>
+        <w:rPr>
+          <w:rFonts w:ascii="Times New Roman" w:hAnsi="Times New Roman" w:cs="Times New Roman"/>
+          <w:sz w:val="18"/>
+          <w:szCs w:val="18"/>
+        </w:rPr>
+        <w:t>Verfies</w:t>
+      </w:r>
+      <w:proofErr w:type="spellEnd"/>
+      <w:r>
+        <w:rPr>
+          <w:rFonts w:ascii="Times New Roman" w:hAnsi="Times New Roman" w:cs="Times New Roman"/>
+          <w:sz w:val="18"/>
+          <w:szCs w:val="18"/>
+        </w:rPr>
+        <w:t xml:space="preserve"> at least 1 uppercase letter</w:t>
+      </w:r>
+    </w:p>
+    <w:p>
+      <w:pPr>
+        <w:pStyle w:val="ListParagraph"/>
+        <w:numPr>
+          <w:ilvl w:val="0"/>
+          <w:numId w:val="4"/>
+        </w:numPr>
+        <w:spacing w:line="480" w:lineRule="auto"/>
+        <w:rPr>
+          <w:rFonts w:ascii="Times New Roman" w:hAnsi="Times New Roman" w:cs="Times New Roman"/>
+          <w:sz w:val="18"/>
+          <w:szCs w:val="18"/>
+        </w:rPr>
+      </w:pPr>
+      <w:r>
+        <w:rPr>
+          <w:rFonts w:ascii="Times New Roman" w:hAnsi="Times New Roman" w:cs="Times New Roman"/>
+          <w:sz w:val="18"/>
+          <w:szCs w:val="18"/>
+        </w:rPr>
+        <w:t>Verifies at least 1 lowercase letter</w:t>
+      </w:r>
+    </w:p>
+    <w:p>
+      <w:pPr>
+        <w:pStyle w:val="ListParagraph"/>
+        <w:numPr>
+          <w:ilvl w:val="0"/>
+          <w:numId w:val="4"/>
+        </w:numPr>
+        <w:spacing w:line="480" w:lineRule="auto"/>
+        <w:rPr>
+          <w:rFonts w:ascii="Times New Roman" w:hAnsi="Times New Roman" w:cs="Times New Roman"/>
+          <w:sz w:val="18"/>
+          <w:szCs w:val="18"/>
+        </w:rPr>
+      </w:pPr>
+      <w:r>
+        <w:rPr>
+          <w:rFonts w:ascii="Times New Roman" w:hAnsi="Times New Roman" w:cs="Times New Roman"/>
+          <w:sz w:val="18"/>
+          <w:szCs w:val="18"/>
+        </w:rPr>
+        <w:t>Verifies at least 1 number</w:t>
+      </w:r>
+    </w:p>
+    <w:p>
+      <w:pPr>
+        <w:pStyle w:val="ListParagraph"/>
+        <w:numPr>
+          <w:ilvl w:val="0"/>
+          <w:numId w:val="4"/>
+        </w:numPr>
+        <w:spacing w:line="480" w:lineRule="auto"/>
+        <w:rPr>
+          <w:rFonts w:ascii="Times New Roman" w:hAnsi="Times New Roman" w:cs="Times New Roman"/>
+          <w:sz w:val="18"/>
+          <w:szCs w:val="18"/>
+        </w:rPr>
+      </w:pPr>
+      <w:r>
+        <w:rPr>
+          <w:rFonts w:ascii="Times New Roman" w:hAnsi="Times New Roman" w:cs="Times New Roman"/>
+          <w:sz w:val="18"/>
+          <w:szCs w:val="18"/>
+        </w:rPr>
+        <w:t>Verifies no inclusion of whitespace</w:t>
+      </w:r>
+    </w:p>
+    <w:p>
+      <w:pPr>
+        <w:pStyle w:val="ListParagraph"/>
+        <w:numPr>
+          <w:ilvl w:val="0"/>
+          <w:numId w:val="4"/>
+        </w:numPr>
+        <w:spacing w:line="480" w:lineRule="auto"/>
+        <w:rPr>
+          <w:rFonts w:ascii="Times New Roman" w:hAnsi="Times New Roman" w:cs="Times New Roman"/>
+          <w:sz w:val="18"/>
+          <w:szCs w:val="18"/>
+        </w:rPr>
+      </w:pPr>
+      <w:r>
+        <w:rPr>
+          <w:rFonts w:ascii="Times New Roman" w:hAnsi="Times New Roman" w:cs="Times New Roman"/>
+          <w:sz w:val="18"/>
+          <w:szCs w:val="18"/>
+        </w:rPr>
+        <w:t xml:space="preserve">Verifies no section/sequence matches </w:t>
+      </w:r>
+      <w:proofErr w:type="spellStart"/>
+      <w:r>
+        <w:rPr>
+          <w:rFonts w:ascii="Times New Roman" w:hAnsi="Times New Roman" w:cs="Times New Roman"/>
+          <w:i/>
+          <w:iCs/>
+          <w:sz w:val="18"/>
+          <w:szCs w:val="18"/>
+        </w:rPr>
+        <w:t>first_name</w:t>
+      </w:r>
+      <w:proofErr w:type="spellEnd"/>
+      <w:r>
+        <w:rPr>
+          <w:rFonts w:ascii="Times New Roman" w:hAnsi="Times New Roman" w:cs="Times New Roman"/>
+          <w:sz w:val="18"/>
+          <w:szCs w:val="18"/>
+        </w:rPr>
+        <w:t xml:space="preserve"> attribute</w:t>
+      </w:r>
+    </w:p>
+    <w:p>
+      <w:pPr>
+        <w:spacing w:line="480" w:lineRule="auto"/>
+        <w:ind w:left="720"/>
+        <w:rPr>
+          <w:rFonts w:ascii="Times New Roman" w:hAnsi="Times New Roman" w:cs="Times New Roman"/>
+          <w:sz w:val="18"/>
+          <w:szCs w:val="18"/>
+        </w:rPr>
+      </w:pPr>
+      <w:proofErr w:type="spellStart"/>
+      <w:r>
+        <w:rPr>
+          <w:rFonts w:ascii="Times New Roman" w:hAnsi="Times New Roman" w:cs="Times New Roman"/>
+          <w:sz w:val="18"/>
+          <w:szCs w:val="18"/>
+        </w:rPr>
+        <w:t>name_</w:t>
+      </w:r>
+      <w:r>
+        <w:rPr>
+          <w:rFonts w:ascii="Times New Roman" w:hAnsi="Times New Roman" w:cs="Times New Roman"/>
+          <w:sz w:val="18"/>
+          <w:szCs w:val="18"/>
+        </w:rPr>
+        <w:t>check</w:t>
+      </w:r>
+      <w:proofErr w:type="spellEnd"/>
+      <w:r>
+        <w:rPr>
+          <w:rFonts w:ascii="Times New Roman" w:hAnsi="Times New Roman" w:cs="Times New Roman"/>
+          <w:sz w:val="18"/>
+          <w:szCs w:val="18"/>
+        </w:rPr>
+        <w:t xml:space="preserve"> (</w:t>
+      </w:r>
+      <w:proofErr w:type="spellStart"/>
+      <w:r>
+        <w:rPr>
+          <w:rFonts w:ascii="Times New Roman" w:hAnsi="Times New Roman" w:cs="Times New Roman"/>
+          <w:sz w:val="18"/>
+          <w:szCs w:val="18"/>
+        </w:rPr>
+        <w:t>args</w:t>
+      </w:r>
+      <w:proofErr w:type="spellEnd"/>
+      <w:r>
+        <w:rPr>
+          <w:rFonts w:ascii="Times New Roman" w:hAnsi="Times New Roman" w:cs="Times New Roman"/>
+          <w:sz w:val="18"/>
+          <w:szCs w:val="18"/>
+        </w:rPr>
+        <w:t xml:space="preserve">: </w:t>
+      </w:r>
+      <w:proofErr w:type="spellStart"/>
+      <w:r>
+        <w:rPr>
+          <w:rFonts w:ascii="Times New Roman" w:hAnsi="Times New Roman" w:cs="Times New Roman"/>
+          <w:i/>
+          <w:iCs/>
+          <w:sz w:val="18"/>
+          <w:szCs w:val="18"/>
+        </w:rPr>
+        <w:t>first_name</w:t>
+      </w:r>
+      <w:proofErr w:type="spellEnd"/>
+      <w:r>
+        <w:rPr>
+          <w:rFonts w:ascii="Times New Roman" w:hAnsi="Times New Roman" w:cs="Times New Roman"/>
+          <w:sz w:val="18"/>
+          <w:szCs w:val="18"/>
+        </w:rPr>
+        <w:t xml:space="preserve">, </w:t>
+      </w:r>
+      <w:proofErr w:type="spellStart"/>
+      <w:r>
+        <w:rPr>
+          <w:rFonts w:ascii="Times New Roman" w:hAnsi="Times New Roman" w:cs="Times New Roman"/>
+          <w:i/>
+          <w:iCs/>
+          <w:sz w:val="18"/>
+          <w:szCs w:val="18"/>
+        </w:rPr>
+        <w:t>last_name</w:t>
+      </w:r>
+      <w:proofErr w:type="spellEnd"/>
+      <w:r>
+        <w:rPr>
+          <w:rFonts w:ascii="Times New Roman" w:hAnsi="Times New Roman" w:cs="Times New Roman"/>
+          <w:sz w:val="18"/>
+          <w:szCs w:val="18"/>
+        </w:rPr>
+        <w:t>)</w:t>
+      </w:r>
+    </w:p>
+    <w:p>
+      <w:pPr>
+        <w:pStyle w:val="ListParagraph"/>
+        <w:numPr>
+          <w:ilvl w:val="0"/>
+          <w:numId w:val="4"/>
+        </w:numPr>
+        <w:spacing w:line="480" w:lineRule="auto"/>
+        <w:rPr>
+          <w:rFonts w:ascii="Times New Roman" w:hAnsi="Times New Roman" w:cs="Times New Roman"/>
+          <w:sz w:val="18"/>
+          <w:szCs w:val="18"/>
+        </w:rPr>
+      </w:pPr>
+      <w:r>
+        <w:rPr>
+          <w:rFonts w:ascii="Times New Roman" w:hAnsi="Times New Roman" w:cs="Times New Roman"/>
+          <w:sz w:val="18"/>
+          <w:szCs w:val="18"/>
+        </w:rPr>
+        <w:t xml:space="preserve">Valid input: letters, diacritic letters, </w:t>
+      </w:r>
+      <w:proofErr w:type="spellStart"/>
+      <w:r>
+        <w:rPr>
+          <w:rFonts w:ascii="Times New Roman" w:hAnsi="Times New Roman" w:cs="Times New Roman"/>
+          <w:sz w:val="18"/>
+          <w:szCs w:val="18"/>
+        </w:rPr>
+        <w:t>hypen</w:t>
+      </w:r>
+      <w:proofErr w:type="spellEnd"/>
+      <w:r>
+        <w:rPr>
+          <w:rFonts w:ascii="Times New Roman" w:hAnsi="Times New Roman" w:cs="Times New Roman"/>
+          <w:sz w:val="18"/>
+          <w:szCs w:val="18"/>
+        </w:rPr>
+        <w:t>, apostrophe</w:t>
+      </w:r>
+    </w:p>
+    <w:p>
+      <w:pPr>
+        <w:pStyle w:val="ListParagraph"/>
+        <w:numPr>
+          <w:ilvl w:val="0"/>
+          <w:numId w:val="4"/>
+        </w:numPr>
+        <w:spacing w:line="480" w:lineRule="auto"/>
+        <w:rPr>
+          <w:rFonts w:ascii="Times New Roman" w:hAnsi="Times New Roman" w:cs="Times New Roman"/>
+          <w:sz w:val="18"/>
+          <w:szCs w:val="18"/>
+        </w:rPr>
+      </w:pPr>
+      <w:r>
+        <w:rPr>
+          <w:rFonts w:ascii="Times New Roman" w:hAnsi="Times New Roman" w:cs="Times New Roman"/>
+          <w:sz w:val="18"/>
+          <w:szCs w:val="18"/>
+        </w:rPr>
+        <w:t>Removes any whitespace</w:t>
+      </w:r>
+    </w:p>
+    <w:p>
+      <w:pPr>
+        <w:spacing w:line="480" w:lineRule="auto"/>
+        <w:ind w:left="720"/>
+        <w:rPr>
+          <w:rFonts w:ascii="Times New Roman" w:hAnsi="Times New Roman" w:cs="Times New Roman"/>
+          <w:sz w:val="18"/>
+          <w:szCs w:val="18"/>
+        </w:rPr>
+      </w:pPr>
+      <w:proofErr w:type="spellStart"/>
+      <w:r>
+        <w:rPr>
+          <w:rFonts w:ascii="Times New Roman" w:hAnsi="Times New Roman" w:cs="Times New Roman"/>
+          <w:sz w:val="18"/>
+          <w:szCs w:val="18"/>
+        </w:rPr>
+        <w:t>role_select</w:t>
+      </w:r>
+      <w:proofErr w:type="spellEnd"/>
+    </w:p>
+    <w:p>
+      <w:pPr>
+        <w:pStyle w:val="ListParagraph"/>
+        <w:numPr>
+          <w:ilvl w:val="0"/>
+          <w:numId w:val="4"/>
+        </w:numPr>
+        <w:spacing w:line="480" w:lineRule="auto"/>
+        <w:rPr>
+          <w:rFonts w:ascii="Times New Roman" w:hAnsi="Times New Roman" w:cs="Times New Roman"/>
+          <w:sz w:val="18"/>
+          <w:szCs w:val="18"/>
+        </w:rPr>
+      </w:pPr>
+      <w:r>
+        <w:rPr>
+          <w:rFonts w:ascii="Times New Roman" w:hAnsi="Times New Roman" w:cs="Times New Roman"/>
+          <w:sz w:val="18"/>
+          <w:szCs w:val="18"/>
+        </w:rPr>
+        <w:t xml:space="preserve">Displays role options to user (Manager, Busboy, </w:t>
+      </w:r>
+      <w:r>
+        <w:rPr>
+          <w:rFonts w:ascii="Times New Roman" w:hAnsi="Times New Roman" w:cs="Times New Roman"/>
+          <w:sz w:val="18"/>
+          <w:szCs w:val="18"/>
+        </w:rPr>
+        <w:t>Kitchen Staff, Wait Staff</w:t>
+      </w:r>
+      <w:r>
+        <w:rPr>
+          <w:rFonts w:ascii="Times New Roman" w:hAnsi="Times New Roman" w:cs="Times New Roman"/>
+          <w:sz w:val="18"/>
+          <w:szCs w:val="18"/>
+        </w:rPr>
+        <w:t>)</w:t>
+      </w:r>
+    </w:p>
+    <w:p>
+      <w:pPr>
+        <w:spacing w:line="480" w:lineRule="auto"/>
+        <w:rPr>
+          <w:rFonts w:ascii="Times New Roman" w:hAnsi="Times New Roman" w:cs="Times New Roman"/>
           <w:b/>
           <w:bCs/>
         </w:rPr>
-        <w:t>Class Functions</w:t>
-      </w:r>
-    </w:p>
-    <w:p>
-      <w:pPr>
-        <w:spacing w:line="480" w:lineRule="auto"/>
-        <w:rPr>
+      </w:pPr>
+      <w:r>
+        <w:rPr>
+          <w:rFonts w:ascii="Times New Roman" w:hAnsi="Times New Roman" w:cs="Times New Roman"/>
           <w:b/>
           <w:bCs/>
         </w:rPr>
-      </w:pPr>
-      <w:r>
-        <w:rPr>
+        <w:t>General Functions</w:t>
+      </w:r>
+    </w:p>
+    <w:p>
+      <w:pPr>
+        <w:spacing w:line="480" w:lineRule="auto"/>
+        <w:ind w:left="720"/>
+        <w:rPr>
+          <w:rFonts w:ascii="Times New Roman" w:hAnsi="Times New Roman" w:cs="Times New Roman"/>
+        </w:rPr>
+      </w:pPr>
+      <w:r>
+        <w:rPr>
+          <w:rFonts w:ascii="Times New Roman" w:hAnsi="Times New Roman" w:cs="Times New Roman"/>
+        </w:rPr>
+        <w:t>//</w:t>
+      </w:r>
+    </w:p>
+    <w:p>
+      <w:pPr>
+        <w:spacing w:line="480" w:lineRule="auto"/>
+        <w:rPr>
+          <w:rFonts w:ascii="Times New Roman" w:hAnsi="Times New Roman" w:cs="Times New Roman"/>
           <w:b/>
           <w:bCs/>
         </w:rPr>
-        <w:t>General Functions</w:t>
-      </w:r>
-    </w:p>
-    <w:p>
-      <w:pPr>
-        <w:spacing w:line="480" w:lineRule="auto"/>
-      </w:pPr>
-      <w:r>
-        <w:rPr>
+      </w:pPr>
+      <w:r>
+        <w:rPr>
+          <w:rFonts w:ascii="Times New Roman" w:hAnsi="Times New Roman" w:cs="Times New Roman"/>
           <w:b/>
           <w:bCs/>
         </w:rPr>
@@ -65,14 +688,98 @@
     <w:p>
       <w:pPr>
         <w:spacing w:line="480" w:lineRule="auto"/>
-      </w:pPr>
-    </w:p>
-    <w:p>
-      <w:pPr>
-        <w:spacing w:line="480" w:lineRule="auto"/>
-      </w:pPr>
-      <w:r>
-        <w:rPr>
+        <w:ind w:left="720"/>
+        <w:rPr>
+          <w:rFonts w:ascii="Times New Roman" w:hAnsi="Times New Roman" w:cs="Times New Roman"/>
+          <w:sz w:val="18"/>
+          <w:szCs w:val="18"/>
+        </w:rPr>
+      </w:pPr>
+      <w:r>
+        <w:rPr>
+          <w:rFonts w:ascii="Times New Roman" w:hAnsi="Times New Roman" w:cs="Times New Roman"/>
+          <w:sz w:val="18"/>
+          <w:szCs w:val="18"/>
+        </w:rPr>
+        <w:t>Invalid name input</w:t>
+      </w:r>
+    </w:p>
+    <w:p>
+      <w:pPr>
+        <w:spacing w:line="480" w:lineRule="auto"/>
+        <w:ind w:left="720"/>
+        <w:rPr>
+          <w:rFonts w:ascii="Times New Roman" w:hAnsi="Times New Roman" w:cs="Times New Roman"/>
+          <w:sz w:val="18"/>
+          <w:szCs w:val="18"/>
+        </w:rPr>
+      </w:pPr>
+      <w:r>
+        <w:rPr>
+          <w:rFonts w:ascii="Times New Roman" w:hAnsi="Times New Roman" w:cs="Times New Roman"/>
+          <w:sz w:val="18"/>
+          <w:szCs w:val="18"/>
+        </w:rPr>
+        <w:t>Invalid password input</w:t>
+      </w:r>
+    </w:p>
+    <w:p>
+      <w:pPr>
+        <w:spacing w:line="480" w:lineRule="auto"/>
+        <w:ind w:left="720"/>
+        <w:rPr>
+          <w:rFonts w:ascii="Times New Roman" w:hAnsi="Times New Roman" w:cs="Times New Roman"/>
+          <w:sz w:val="18"/>
+          <w:szCs w:val="18"/>
+        </w:rPr>
+      </w:pPr>
+      <w:r>
+        <w:rPr>
+          <w:rFonts w:ascii="Times New Roman" w:hAnsi="Times New Roman" w:cs="Times New Roman"/>
+          <w:sz w:val="18"/>
+          <w:szCs w:val="18"/>
+        </w:rPr>
+        <w:lastRenderedPageBreak/>
+        <w:t>Incorrect password</w:t>
+      </w:r>
+    </w:p>
+    <w:p>
+      <w:pPr>
+        <w:spacing w:line="480" w:lineRule="auto"/>
+        <w:ind w:left="720"/>
+        <w:rPr>
+          <w:rFonts w:ascii="Times New Roman" w:hAnsi="Times New Roman" w:cs="Times New Roman"/>
+          <w:sz w:val="18"/>
+          <w:szCs w:val="18"/>
+        </w:rPr>
+      </w:pPr>
+      <w:r>
+        <w:rPr>
+          <w:rFonts w:ascii="Times New Roman" w:hAnsi="Times New Roman" w:cs="Times New Roman"/>
+          <w:sz w:val="18"/>
+          <w:szCs w:val="18"/>
+        </w:rPr>
+        <w:t>Incorrect username</w:t>
+      </w:r>
+    </w:p>
+    <w:p>
+      <w:pPr>
+        <w:spacing w:line="480" w:lineRule="auto"/>
+        <w:rPr>
+          <w:rFonts w:ascii="Times New Roman" w:hAnsi="Times New Roman" w:cs="Times New Roman"/>
+        </w:rPr>
+      </w:pPr>
+    </w:p>
+    <w:p>
+      <w:pPr>
+        <w:spacing w:line="480" w:lineRule="auto"/>
+        <w:rPr>
+          <w:rFonts w:ascii="Times New Roman" w:hAnsi="Times New Roman" w:cs="Times New Roman"/>
+        </w:rPr>
+      </w:pPr>
+      <w:r>
+        <w:rPr>
+          <w:rFonts w:ascii="Times New Roman" w:hAnsi="Times New Roman" w:cs="Times New Roman"/>
           <w:b/>
           <w:bCs/>
         </w:rPr>
@@ -87,8 +794,18 @@
           <w:numId w:val="1"/>
         </w:numPr>
         <w:spacing w:line="480" w:lineRule="auto"/>
-      </w:pPr>
-      <w:r>
+        <w:rPr>
+          <w:rFonts w:ascii="Times New Roman" w:hAnsi="Times New Roman" w:cs="Times New Roman"/>
+          <w:sz w:val="18"/>
+          <w:szCs w:val="18"/>
+        </w:rPr>
+      </w:pPr>
+      <w:r>
+        <w:rPr>
+          <w:rFonts w:ascii="Times New Roman" w:hAnsi="Times New Roman" w:cs="Times New Roman"/>
+          <w:sz w:val="18"/>
+          <w:szCs w:val="18"/>
+        </w:rPr>
         <w:t>User inputs username</w:t>
       </w:r>
     </w:p>
@@ -100,8 +817,18 @@
           <w:numId w:val="1"/>
         </w:numPr>
         <w:spacing w:line="480" w:lineRule="auto"/>
-      </w:pPr>
-      <w:r>
+        <w:rPr>
+          <w:rFonts w:ascii="Times New Roman" w:hAnsi="Times New Roman" w:cs="Times New Roman"/>
+          <w:sz w:val="18"/>
+          <w:szCs w:val="18"/>
+        </w:rPr>
+      </w:pPr>
+      <w:r>
+        <w:rPr>
+          <w:rFonts w:ascii="Times New Roman" w:hAnsi="Times New Roman" w:cs="Times New Roman"/>
+          <w:sz w:val="18"/>
+          <w:szCs w:val="18"/>
+        </w:rPr>
         <w:t>User inputs password</w:t>
       </w:r>
     </w:p>
@@ -113,8 +840,18 @@
           <w:numId w:val="1"/>
         </w:numPr>
         <w:spacing w:line="480" w:lineRule="auto"/>
-      </w:pPr>
-      <w:r>
+        <w:rPr>
+          <w:rFonts w:ascii="Times New Roman" w:hAnsi="Times New Roman" w:cs="Times New Roman"/>
+          <w:sz w:val="18"/>
+          <w:szCs w:val="18"/>
+        </w:rPr>
+      </w:pPr>
+      <w:r>
+        <w:rPr>
+          <w:rFonts w:ascii="Times New Roman" w:hAnsi="Times New Roman" w:cs="Times New Roman"/>
+          <w:sz w:val="18"/>
+          <w:szCs w:val="18"/>
+        </w:rPr>
         <w:t>User clicks “Submit”</w:t>
       </w:r>
     </w:p>
@@ -126,36 +863,72 @@
           <w:numId w:val="1"/>
         </w:numPr>
         <w:spacing w:line="480" w:lineRule="auto"/>
-      </w:pPr>
-      <w:r>
+        <w:rPr>
+          <w:rFonts w:ascii="Times New Roman" w:hAnsi="Times New Roman" w:cs="Times New Roman"/>
+          <w:sz w:val="18"/>
+          <w:szCs w:val="18"/>
+        </w:rPr>
+      </w:pPr>
+      <w:r>
+        <w:rPr>
+          <w:rFonts w:ascii="Times New Roman" w:hAnsi="Times New Roman" w:cs="Times New Roman"/>
+          <w:sz w:val="18"/>
+          <w:szCs w:val="18"/>
+        </w:rPr>
         <w:t xml:space="preserve">System checks database to locate Account object with equivalent values in the </w:t>
       </w:r>
       <w:r>
         <w:rPr>
+          <w:rFonts w:ascii="Times New Roman" w:hAnsi="Times New Roman" w:cs="Times New Roman"/>
           <w:i/>
           <w:iCs/>
+          <w:sz w:val="18"/>
+          <w:szCs w:val="18"/>
         </w:rPr>
         <w:t>username</w:t>
       </w:r>
       <w:r>
+        <w:rPr>
+          <w:rFonts w:ascii="Times New Roman" w:hAnsi="Times New Roman" w:cs="Times New Roman"/>
+          <w:sz w:val="18"/>
+          <w:szCs w:val="18"/>
+        </w:rPr>
         <w:t xml:space="preserve"> and </w:t>
       </w:r>
       <w:r>
         <w:rPr>
+          <w:rFonts w:ascii="Times New Roman" w:hAnsi="Times New Roman" w:cs="Times New Roman"/>
           <w:i/>
           <w:iCs/>
+          <w:sz w:val="18"/>
+          <w:szCs w:val="18"/>
         </w:rPr>
         <w:t>password</w:t>
       </w:r>
       <w:r>
+        <w:rPr>
+          <w:rFonts w:ascii="Times New Roman" w:hAnsi="Times New Roman" w:cs="Times New Roman"/>
+          <w:sz w:val="18"/>
+          <w:szCs w:val="18"/>
+        </w:rPr>
         <w:t xml:space="preserve"> variables.</w:t>
       </w:r>
     </w:p>
     <w:p>
       <w:pPr>
         <w:spacing w:line="480" w:lineRule="auto"/>
-      </w:pPr>
-      <w:r>
+        <w:rPr>
+          <w:rFonts w:ascii="Times New Roman" w:hAnsi="Times New Roman" w:cs="Times New Roman"/>
+          <w:sz w:val="18"/>
+          <w:szCs w:val="18"/>
+        </w:rPr>
+      </w:pPr>
+      <w:r>
+        <w:rPr>
+          <w:rFonts w:ascii="Times New Roman" w:hAnsi="Times New Roman" w:cs="Times New Roman"/>
+          <w:sz w:val="18"/>
+          <w:szCs w:val="18"/>
+        </w:rPr>
         <w:t>If the system locates an Account object with equivalent values in both username and password variables:</w:t>
       </w:r>
     </w:p>
@@ -167,29 +940,62 @@
           <w:numId w:val="1"/>
         </w:numPr>
         <w:spacing w:line="480" w:lineRule="auto"/>
-      </w:pPr>
-      <w:r>
+        <w:rPr>
+          <w:rFonts w:ascii="Times New Roman" w:hAnsi="Times New Roman" w:cs="Times New Roman"/>
+          <w:sz w:val="18"/>
+          <w:szCs w:val="18"/>
+        </w:rPr>
+      </w:pPr>
+      <w:r>
+        <w:rPr>
+          <w:rFonts w:ascii="Times New Roman" w:hAnsi="Times New Roman" w:cs="Times New Roman"/>
+          <w:sz w:val="18"/>
+          <w:szCs w:val="18"/>
+        </w:rPr>
         <w:t xml:space="preserve">The program checks the value of the object’s </w:t>
       </w:r>
       <w:r>
         <w:rPr>
+          <w:rFonts w:ascii="Times New Roman" w:hAnsi="Times New Roman" w:cs="Times New Roman"/>
           <w:i/>
           <w:iCs/>
+          <w:sz w:val="18"/>
+          <w:szCs w:val="18"/>
         </w:rPr>
         <w:t>role</w:t>
       </w:r>
       <w:r>
+        <w:rPr>
+          <w:rFonts w:ascii="Times New Roman" w:hAnsi="Times New Roman" w:cs="Times New Roman"/>
+          <w:sz w:val="18"/>
+          <w:szCs w:val="18"/>
+        </w:rPr>
         <w:t xml:space="preserve"> variable to determine where to send the user next.</w:t>
       </w:r>
     </w:p>
     <w:p>
       <w:pPr>
         <w:spacing w:line="480" w:lineRule="auto"/>
-      </w:pPr>
-      <w:r>
+        <w:rPr>
+          <w:rFonts w:ascii="Times New Roman" w:hAnsi="Times New Roman" w:cs="Times New Roman"/>
+          <w:sz w:val="18"/>
+          <w:szCs w:val="18"/>
+        </w:rPr>
+      </w:pPr>
+      <w:r>
+        <w:rPr>
+          <w:rFonts w:ascii="Times New Roman" w:hAnsi="Times New Roman" w:cs="Times New Roman"/>
+          <w:sz w:val="18"/>
+          <w:szCs w:val="18"/>
+        </w:rPr>
         <w:t>If neither or only one variable value matches</w:t>
       </w:r>
       <w:r>
+        <w:rPr>
+          <w:rFonts w:ascii="Times New Roman" w:hAnsi="Times New Roman" w:cs="Times New Roman"/>
+          <w:sz w:val="18"/>
+          <w:szCs w:val="18"/>
+        </w:rPr>
         <w:t>:</w:t>
       </w:r>
     </w:p>
@@ -201,25 +1007,39 @@
           <w:numId w:val="1"/>
         </w:numPr>
         <w:spacing w:line="480" w:lineRule="auto"/>
-      </w:pPr>
-      <w:r>
+        <w:rPr>
+          <w:rFonts w:ascii="Times New Roman" w:hAnsi="Times New Roman" w:cs="Times New Roman"/>
+          <w:sz w:val="18"/>
+          <w:szCs w:val="18"/>
+        </w:rPr>
+      </w:pPr>
+      <w:r>
+        <w:rPr>
+          <w:rFonts w:ascii="Times New Roman" w:hAnsi="Times New Roman" w:cs="Times New Roman"/>
+          <w:sz w:val="18"/>
+          <w:szCs w:val="18"/>
+        </w:rPr>
         <w:t>S</w:t>
       </w:r>
       <w:r>
+        <w:rPr>
+          <w:rFonts w:ascii="Times New Roman" w:hAnsi="Times New Roman" w:cs="Times New Roman"/>
+          <w:sz w:val="18"/>
+          <w:szCs w:val="18"/>
+        </w:rPr>
         <w:t>ystem displays an error message and remains on the login page.</w:t>
       </w:r>
     </w:p>
     <w:p>
       <w:pPr>
         <w:spacing w:line="480" w:lineRule="auto"/>
-      </w:pPr>
-    </w:p>
-    <w:p>
-      <w:pPr>
-        <w:spacing w:line="480" w:lineRule="auto"/>
-      </w:pPr>
-      <w:r>
-        <w:rPr>
+        <w:rPr>
+          <w:rFonts w:ascii="Times New Roman" w:hAnsi="Times New Roman" w:cs="Times New Roman"/>
+        </w:rPr>
+      </w:pPr>
+      <w:r>
+        <w:rPr>
+          <w:rFonts w:ascii="Times New Roman" w:hAnsi="Times New Roman" w:cs="Times New Roman"/>
           <w:b/>
           <w:bCs/>
         </w:rPr>
@@ -234,9 +1054,18 @@
           <w:numId w:val="2"/>
         </w:numPr>
         <w:spacing w:line="480" w:lineRule="auto"/>
-      </w:pPr>
-      <w:r>
-        <w:lastRenderedPageBreak/>
+        <w:rPr>
+          <w:rFonts w:ascii="Times New Roman" w:hAnsi="Times New Roman" w:cs="Times New Roman"/>
+          <w:sz w:val="18"/>
+          <w:szCs w:val="18"/>
+        </w:rPr>
+      </w:pPr>
+      <w:r>
+        <w:rPr>
+          <w:rFonts w:ascii="Times New Roman" w:hAnsi="Times New Roman" w:cs="Times New Roman"/>
+          <w:sz w:val="18"/>
+          <w:szCs w:val="18"/>
+        </w:rPr>
         <w:t>User clicks “Sign Up” button located on login page</w:t>
       </w:r>
     </w:p>
@@ -248,16 +1077,36 @@
           <w:numId w:val="2"/>
         </w:numPr>
         <w:spacing w:line="480" w:lineRule="auto"/>
-      </w:pPr>
-      <w:r>
+        <w:rPr>
+          <w:rFonts w:ascii="Times New Roman" w:hAnsi="Times New Roman" w:cs="Times New Roman"/>
+          <w:sz w:val="18"/>
+          <w:szCs w:val="18"/>
+        </w:rPr>
+      </w:pPr>
+      <w:r>
+        <w:rPr>
+          <w:rFonts w:ascii="Times New Roman" w:hAnsi="Times New Roman" w:cs="Times New Roman"/>
+          <w:sz w:val="18"/>
+          <w:szCs w:val="18"/>
+        </w:rPr>
         <w:t xml:space="preserve">The system sends the user to the </w:t>
       </w:r>
       <w:proofErr w:type="gramStart"/>
       <w:r>
+        <w:rPr>
+          <w:rFonts w:ascii="Times New Roman" w:hAnsi="Times New Roman" w:cs="Times New Roman"/>
+          <w:sz w:val="18"/>
+          <w:szCs w:val="18"/>
+        </w:rPr>
         <w:t>sign up</w:t>
       </w:r>
       <w:proofErr w:type="gramEnd"/>
       <w:r>
+        <w:rPr>
+          <w:rFonts w:ascii="Times New Roman" w:hAnsi="Times New Roman" w:cs="Times New Roman"/>
+          <w:sz w:val="18"/>
+          <w:szCs w:val="18"/>
+        </w:rPr>
         <w:t xml:space="preserve"> page</w:t>
       </w:r>
     </w:p>
@@ -269,8 +1118,18 @@
           <w:numId w:val="2"/>
         </w:numPr>
         <w:spacing w:line="480" w:lineRule="auto"/>
-      </w:pPr>
-      <w:r>
+        <w:rPr>
+          <w:rFonts w:ascii="Times New Roman" w:hAnsi="Times New Roman" w:cs="Times New Roman"/>
+          <w:sz w:val="18"/>
+          <w:szCs w:val="18"/>
+        </w:rPr>
+      </w:pPr>
+      <w:r>
+        <w:rPr>
+          <w:rFonts w:ascii="Times New Roman" w:hAnsi="Times New Roman" w:cs="Times New Roman"/>
+          <w:sz w:val="18"/>
+          <w:szCs w:val="18"/>
+        </w:rPr>
         <w:t>User inputs first name</w:t>
       </w:r>
     </w:p>
@@ -282,8 +1141,18 @@
           <w:numId w:val="2"/>
         </w:numPr>
         <w:spacing w:line="480" w:lineRule="auto"/>
-      </w:pPr>
-      <w:r>
+        <w:rPr>
+          <w:rFonts w:ascii="Times New Roman" w:hAnsi="Times New Roman" w:cs="Times New Roman"/>
+          <w:sz w:val="18"/>
+          <w:szCs w:val="18"/>
+        </w:rPr>
+      </w:pPr>
+      <w:r>
+        <w:rPr>
+          <w:rFonts w:ascii="Times New Roman" w:hAnsi="Times New Roman" w:cs="Times New Roman"/>
+          <w:sz w:val="18"/>
+          <w:szCs w:val="18"/>
+        </w:rPr>
         <w:t>User enters last name</w:t>
       </w:r>
     </w:p>
@@ -295,16 +1164,36 @@
           <w:numId w:val="2"/>
         </w:numPr>
         <w:spacing w:line="480" w:lineRule="auto"/>
-      </w:pPr>
-      <w:r>
+        <w:rPr>
+          <w:rFonts w:ascii="Times New Roman" w:hAnsi="Times New Roman" w:cs="Times New Roman"/>
+          <w:sz w:val="18"/>
+          <w:szCs w:val="18"/>
+        </w:rPr>
+      </w:pPr>
+      <w:r>
+        <w:rPr>
+          <w:rFonts w:ascii="Times New Roman" w:hAnsi="Times New Roman" w:cs="Times New Roman"/>
+          <w:sz w:val="18"/>
+          <w:szCs w:val="18"/>
+        </w:rPr>
         <w:t xml:space="preserve">User selects their role from the </w:t>
       </w:r>
       <w:proofErr w:type="gramStart"/>
       <w:r>
+        <w:rPr>
+          <w:rFonts w:ascii="Times New Roman" w:hAnsi="Times New Roman" w:cs="Times New Roman"/>
+          <w:sz w:val="18"/>
+          <w:szCs w:val="18"/>
+        </w:rPr>
         <w:t>drop down</w:t>
       </w:r>
       <w:proofErr w:type="gramEnd"/>
       <w:r>
+        <w:rPr>
+          <w:rFonts w:ascii="Times New Roman" w:hAnsi="Times New Roman" w:cs="Times New Roman"/>
+          <w:sz w:val="18"/>
+          <w:szCs w:val="18"/>
+        </w:rPr>
         <w:t xml:space="preserve"> menu</w:t>
       </w:r>
     </w:p>
@@ -316,8 +1205,18 @@
           <w:numId w:val="2"/>
         </w:numPr>
         <w:spacing w:line="480" w:lineRule="auto"/>
-      </w:pPr>
-      <w:r>
+        <w:rPr>
+          <w:rFonts w:ascii="Times New Roman" w:hAnsi="Times New Roman" w:cs="Times New Roman"/>
+          <w:sz w:val="18"/>
+          <w:szCs w:val="18"/>
+        </w:rPr>
+      </w:pPr>
+      <w:r>
+        <w:rPr>
+          <w:rFonts w:ascii="Times New Roman" w:hAnsi="Times New Roman" w:cs="Times New Roman"/>
+          <w:sz w:val="18"/>
+          <w:szCs w:val="18"/>
+        </w:rPr>
         <w:t>User clicks “Submit”</w:t>
       </w:r>
     </w:p>
@@ -329,52 +1228,96 @@
           <w:numId w:val="2"/>
         </w:numPr>
         <w:spacing w:line="480" w:lineRule="auto"/>
-      </w:pPr>
-      <w:r>
+        <w:rPr>
+          <w:rFonts w:ascii="Times New Roman" w:hAnsi="Times New Roman" w:cs="Times New Roman"/>
+          <w:sz w:val="18"/>
+          <w:szCs w:val="18"/>
+        </w:rPr>
+      </w:pPr>
+      <w:r>
+        <w:rPr>
+          <w:rFonts w:ascii="Times New Roman" w:hAnsi="Times New Roman" w:cs="Times New Roman"/>
+          <w:sz w:val="18"/>
+          <w:szCs w:val="18"/>
+        </w:rPr>
         <w:t xml:space="preserve">System passes the </w:t>
       </w:r>
       <w:proofErr w:type="spellStart"/>
       <w:r>
         <w:rPr>
+          <w:rFonts w:ascii="Times New Roman" w:hAnsi="Times New Roman" w:cs="Times New Roman"/>
           <w:i/>
           <w:iCs/>
+          <w:sz w:val="18"/>
+          <w:szCs w:val="18"/>
         </w:rPr>
         <w:t>first_name</w:t>
       </w:r>
       <w:proofErr w:type="spellEnd"/>
       <w:r>
+        <w:rPr>
+          <w:rFonts w:ascii="Times New Roman" w:hAnsi="Times New Roman" w:cs="Times New Roman"/>
+          <w:sz w:val="18"/>
+          <w:szCs w:val="18"/>
+        </w:rPr>
         <w:t xml:space="preserve"> and </w:t>
       </w:r>
       <w:proofErr w:type="spellStart"/>
       <w:r>
         <w:rPr>
+          <w:rFonts w:ascii="Times New Roman" w:hAnsi="Times New Roman" w:cs="Times New Roman"/>
           <w:i/>
           <w:iCs/>
+          <w:sz w:val="18"/>
+          <w:szCs w:val="18"/>
         </w:rPr>
         <w:t>last_name</w:t>
       </w:r>
       <w:proofErr w:type="spellEnd"/>
       <w:r>
+        <w:rPr>
+          <w:rFonts w:ascii="Times New Roman" w:hAnsi="Times New Roman" w:cs="Times New Roman"/>
+          <w:sz w:val="18"/>
+          <w:szCs w:val="18"/>
+        </w:rPr>
         <w:t xml:space="preserve"> inputs through the </w:t>
       </w:r>
       <w:proofErr w:type="spellStart"/>
       <w:r>
         <w:rPr>
+          <w:rFonts w:ascii="Times New Roman" w:hAnsi="Times New Roman" w:cs="Times New Roman"/>
           <w:i/>
           <w:iCs/>
+          <w:sz w:val="18"/>
+          <w:szCs w:val="18"/>
         </w:rPr>
         <w:t>name_check</w:t>
       </w:r>
       <w:proofErr w:type="spellEnd"/>
       <w:r>
+        <w:rPr>
+          <w:rFonts w:ascii="Times New Roman" w:hAnsi="Times New Roman" w:cs="Times New Roman"/>
+          <w:sz w:val="18"/>
+          <w:szCs w:val="18"/>
+        </w:rPr>
         <w:t xml:space="preserve"> function</w:t>
       </w:r>
     </w:p>
     <w:p>
       <w:pPr>
         <w:spacing w:line="480" w:lineRule="auto"/>
-      </w:pPr>
-      <w:r>
+        <w:rPr>
+          <w:rFonts w:ascii="Times New Roman" w:hAnsi="Times New Roman" w:cs="Times New Roman"/>
+          <w:sz w:val="18"/>
+          <w:szCs w:val="18"/>
+        </w:rPr>
+      </w:pPr>
+      <w:r>
+        <w:rPr>
+          <w:rFonts w:ascii="Times New Roman" w:hAnsi="Times New Roman" w:cs="Times New Roman"/>
+          <w:sz w:val="18"/>
+          <w:szCs w:val="18"/>
+        </w:rPr>
         <w:t>If the input is invalid for either or both variables:</w:t>
       </w:r>
     </w:p>
@@ -386,32 +1329,72 @@
           <w:numId w:val="2"/>
         </w:numPr>
         <w:spacing w:line="480" w:lineRule="auto"/>
-      </w:pPr>
-      <w:r>
+        <w:rPr>
+          <w:rFonts w:ascii="Times New Roman" w:hAnsi="Times New Roman" w:cs="Times New Roman"/>
+          <w:sz w:val="18"/>
+          <w:szCs w:val="18"/>
+        </w:rPr>
+      </w:pPr>
+      <w:r>
+        <w:rPr>
+          <w:rFonts w:ascii="Times New Roman" w:hAnsi="Times New Roman" w:cs="Times New Roman"/>
+          <w:sz w:val="18"/>
+          <w:szCs w:val="18"/>
+        </w:rPr>
         <w:t xml:space="preserve">System displays error </w:t>
       </w:r>
       <w:proofErr w:type="gramStart"/>
       <w:r>
+        <w:rPr>
+          <w:rFonts w:ascii="Times New Roman" w:hAnsi="Times New Roman" w:cs="Times New Roman"/>
+          <w:sz w:val="18"/>
+          <w:szCs w:val="18"/>
+        </w:rPr>
         <w:t>message</w:t>
       </w:r>
       <w:proofErr w:type="gramEnd"/>
       <w:r>
+        <w:rPr>
+          <w:rFonts w:ascii="Times New Roman" w:hAnsi="Times New Roman" w:cs="Times New Roman"/>
+          <w:sz w:val="18"/>
+          <w:szCs w:val="18"/>
+        </w:rPr>
         <w:t xml:space="preserve"> and remains on this </w:t>
       </w:r>
       <w:proofErr w:type="gramStart"/>
       <w:r>
+        <w:rPr>
+          <w:rFonts w:ascii="Times New Roman" w:hAnsi="Times New Roman" w:cs="Times New Roman"/>
+          <w:sz w:val="18"/>
+          <w:szCs w:val="18"/>
+        </w:rPr>
         <w:t>sign up</w:t>
       </w:r>
       <w:proofErr w:type="gramEnd"/>
       <w:r>
+        <w:rPr>
+          <w:rFonts w:ascii="Times New Roman" w:hAnsi="Times New Roman" w:cs="Times New Roman"/>
+          <w:sz w:val="18"/>
+          <w:szCs w:val="18"/>
+        </w:rPr>
         <w:t xml:space="preserve"> page.</w:t>
       </w:r>
     </w:p>
     <w:p>
       <w:pPr>
         <w:spacing w:line="480" w:lineRule="auto"/>
-      </w:pPr>
-      <w:r>
+        <w:rPr>
+          <w:rFonts w:ascii="Times New Roman" w:hAnsi="Times New Roman" w:cs="Times New Roman"/>
+          <w:sz w:val="18"/>
+          <w:szCs w:val="18"/>
+        </w:rPr>
+      </w:pPr>
+      <w:r>
+        <w:rPr>
+          <w:rFonts w:ascii="Times New Roman" w:hAnsi="Times New Roman" w:cs="Times New Roman"/>
+          <w:sz w:val="18"/>
+          <w:szCs w:val="18"/>
+        </w:rPr>
         <w:t>If the input is valid:</w:t>
       </w:r>
     </w:p>
@@ -423,8 +1406,18 @@
           <w:numId w:val="2"/>
         </w:numPr>
         <w:spacing w:line="480" w:lineRule="auto"/>
-      </w:pPr>
-      <w:r>
+        <w:rPr>
+          <w:rFonts w:ascii="Times New Roman" w:hAnsi="Times New Roman" w:cs="Times New Roman"/>
+          <w:sz w:val="18"/>
+          <w:szCs w:val="18"/>
+        </w:rPr>
+      </w:pPr>
+      <w:r>
+        <w:rPr>
+          <w:rFonts w:ascii="Times New Roman" w:hAnsi="Times New Roman" w:cs="Times New Roman"/>
+          <w:sz w:val="18"/>
+          <w:szCs w:val="18"/>
+        </w:rPr>
         <w:t>User data is saved.</w:t>
       </w:r>
     </w:p>
@@ -436,28 +1429,53 @@
           <w:numId w:val="2"/>
         </w:numPr>
         <w:spacing w:line="480" w:lineRule="auto"/>
-      </w:pPr>
-      <w:r>
+        <w:rPr>
+          <w:rFonts w:ascii="Times New Roman" w:hAnsi="Times New Roman" w:cs="Times New Roman"/>
+          <w:sz w:val="18"/>
+          <w:szCs w:val="18"/>
+        </w:rPr>
+      </w:pPr>
+      <w:r>
+        <w:rPr>
+          <w:rFonts w:ascii="Times New Roman" w:hAnsi="Times New Roman" w:cs="Times New Roman"/>
+          <w:sz w:val="18"/>
+          <w:szCs w:val="18"/>
+        </w:rPr>
         <w:t xml:space="preserve">User is sent to the next </w:t>
       </w:r>
       <w:proofErr w:type="gramStart"/>
       <w:r>
+        <w:rPr>
+          <w:rFonts w:ascii="Times New Roman" w:hAnsi="Times New Roman" w:cs="Times New Roman"/>
+          <w:sz w:val="18"/>
+          <w:szCs w:val="18"/>
+        </w:rPr>
         <w:t>sign up</w:t>
       </w:r>
       <w:proofErr w:type="gramEnd"/>
       <w:r>
+        <w:rPr>
+          <w:rFonts w:ascii="Times New Roman" w:hAnsi="Times New Roman" w:cs="Times New Roman"/>
+          <w:sz w:val="18"/>
+          <w:szCs w:val="18"/>
+        </w:rPr>
         <w:t xml:space="preserve"> page.</w:t>
       </w:r>
     </w:p>
     <w:p>
       <w:pPr>
         <w:spacing w:line="480" w:lineRule="auto"/>
-      </w:pPr>
-      <w:r>
-        <w:rPr>
+        <w:rPr>
+          <w:rFonts w:ascii="Times New Roman" w:hAnsi="Times New Roman" w:cs="Times New Roman"/>
+        </w:rPr>
+      </w:pPr>
+      <w:r>
+        <w:rPr>
+          <w:rFonts w:ascii="Times New Roman" w:hAnsi="Times New Roman" w:cs="Times New Roman"/>
           <w:b/>
           <w:bCs/>
         </w:rPr>
+        <w:lastRenderedPageBreak/>
         <w:t>Sign Up Process pt.2</w:t>
       </w:r>
     </w:p>
@@ -469,8 +1487,18 @@
           <w:numId w:val="3"/>
         </w:numPr>
         <w:spacing w:line="480" w:lineRule="auto"/>
-      </w:pPr>
-      <w:r>
+        <w:rPr>
+          <w:rFonts w:ascii="Times New Roman" w:hAnsi="Times New Roman" w:cs="Times New Roman"/>
+          <w:sz w:val="18"/>
+          <w:szCs w:val="18"/>
+        </w:rPr>
+      </w:pPr>
+      <w:r>
+        <w:rPr>
+          <w:rFonts w:ascii="Times New Roman" w:hAnsi="Times New Roman" w:cs="Times New Roman"/>
+          <w:sz w:val="18"/>
+          <w:szCs w:val="18"/>
+        </w:rPr>
         <w:t>User inputs username</w:t>
       </w:r>
     </w:p>
@@ -482,8 +1510,18 @@
           <w:numId w:val="3"/>
         </w:numPr>
         <w:spacing w:line="480" w:lineRule="auto"/>
-      </w:pPr>
-      <w:r>
+        <w:rPr>
+          <w:rFonts w:ascii="Times New Roman" w:hAnsi="Times New Roman" w:cs="Times New Roman"/>
+          <w:sz w:val="18"/>
+          <w:szCs w:val="18"/>
+        </w:rPr>
+      </w:pPr>
+      <w:r>
+        <w:rPr>
+          <w:rFonts w:ascii="Times New Roman" w:hAnsi="Times New Roman" w:cs="Times New Roman"/>
+          <w:sz w:val="18"/>
+          <w:szCs w:val="18"/>
+        </w:rPr>
         <w:t>User inputs password</w:t>
       </w:r>
     </w:p>
@@ -495,8 +1533,18 @@
           <w:numId w:val="3"/>
         </w:numPr>
         <w:spacing w:line="480" w:lineRule="auto"/>
-      </w:pPr>
-      <w:r>
+        <w:rPr>
+          <w:rFonts w:ascii="Times New Roman" w:hAnsi="Times New Roman" w:cs="Times New Roman"/>
+          <w:sz w:val="18"/>
+          <w:szCs w:val="18"/>
+        </w:rPr>
+      </w:pPr>
+      <w:r>
+        <w:rPr>
+          <w:rFonts w:ascii="Times New Roman" w:hAnsi="Times New Roman" w:cs="Times New Roman"/>
+          <w:sz w:val="18"/>
+          <w:szCs w:val="18"/>
+        </w:rPr>
         <w:t>User clicks “Submit”</w:t>
       </w:r>
     </w:p>
@@ -508,40 +1556,76 @@
           <w:numId w:val="3"/>
         </w:numPr>
         <w:spacing w:line="480" w:lineRule="auto"/>
-      </w:pPr>
-      <w:r>
+        <w:rPr>
+          <w:rFonts w:ascii="Times New Roman" w:hAnsi="Times New Roman" w:cs="Times New Roman"/>
+          <w:sz w:val="18"/>
+          <w:szCs w:val="18"/>
+        </w:rPr>
+      </w:pPr>
+      <w:r>
+        <w:rPr>
+          <w:rFonts w:ascii="Times New Roman" w:hAnsi="Times New Roman" w:cs="Times New Roman"/>
+          <w:sz w:val="18"/>
+          <w:szCs w:val="18"/>
+        </w:rPr>
         <w:t xml:space="preserve">System passes the inputs through the </w:t>
       </w:r>
       <w:proofErr w:type="spellStart"/>
       <w:r>
         <w:rPr>
+          <w:rFonts w:ascii="Times New Roman" w:hAnsi="Times New Roman" w:cs="Times New Roman"/>
           <w:i/>
           <w:iCs/>
+          <w:sz w:val="18"/>
+          <w:szCs w:val="18"/>
         </w:rPr>
         <w:t>username_check</w:t>
       </w:r>
       <w:proofErr w:type="spellEnd"/>
       <w:r>
+        <w:rPr>
+          <w:rFonts w:ascii="Times New Roman" w:hAnsi="Times New Roman" w:cs="Times New Roman"/>
+          <w:sz w:val="18"/>
+          <w:szCs w:val="18"/>
+        </w:rPr>
         <w:t xml:space="preserve"> and </w:t>
       </w:r>
       <w:proofErr w:type="spellStart"/>
       <w:r>
         <w:rPr>
+          <w:rFonts w:ascii="Times New Roman" w:hAnsi="Times New Roman" w:cs="Times New Roman"/>
           <w:i/>
           <w:iCs/>
+          <w:sz w:val="18"/>
+          <w:szCs w:val="18"/>
         </w:rPr>
         <w:t>password_check</w:t>
       </w:r>
       <w:proofErr w:type="spellEnd"/>
       <w:r>
+        <w:rPr>
+          <w:rFonts w:ascii="Times New Roman" w:hAnsi="Times New Roman" w:cs="Times New Roman"/>
+          <w:sz w:val="18"/>
+          <w:szCs w:val="18"/>
+        </w:rPr>
         <w:t xml:space="preserve"> functions.</w:t>
       </w:r>
     </w:p>
     <w:p>
       <w:pPr>
         <w:spacing w:line="480" w:lineRule="auto"/>
-      </w:pPr>
-      <w:r>
+        <w:rPr>
+          <w:rFonts w:ascii="Times New Roman" w:hAnsi="Times New Roman" w:cs="Times New Roman"/>
+          <w:sz w:val="18"/>
+          <w:szCs w:val="18"/>
+        </w:rPr>
+      </w:pPr>
+      <w:r>
+        <w:rPr>
+          <w:rFonts w:ascii="Times New Roman" w:hAnsi="Times New Roman" w:cs="Times New Roman"/>
+          <w:sz w:val="18"/>
+          <w:szCs w:val="18"/>
+        </w:rPr>
         <w:t>If the username is invalid:</w:t>
       </w:r>
     </w:p>
@@ -553,25 +1637,54 @@
           <w:numId w:val="3"/>
         </w:numPr>
         <w:spacing w:line="480" w:lineRule="auto"/>
-      </w:pPr>
-      <w:r>
-        <w:lastRenderedPageBreak/>
+        <w:rPr>
+          <w:rFonts w:ascii="Times New Roman" w:hAnsi="Times New Roman" w:cs="Times New Roman"/>
+          <w:sz w:val="18"/>
+          <w:szCs w:val="18"/>
+        </w:rPr>
+      </w:pPr>
+      <w:r>
+        <w:rPr>
+          <w:rFonts w:ascii="Times New Roman" w:hAnsi="Times New Roman" w:cs="Times New Roman"/>
+          <w:sz w:val="18"/>
+          <w:szCs w:val="18"/>
+        </w:rPr>
         <w:t xml:space="preserve">Error </w:t>
       </w:r>
       <w:proofErr w:type="gramStart"/>
       <w:r>
+        <w:rPr>
+          <w:rFonts w:ascii="Times New Roman" w:hAnsi="Times New Roman" w:cs="Times New Roman"/>
+          <w:sz w:val="18"/>
+          <w:szCs w:val="18"/>
+        </w:rPr>
         <w:t>message is</w:t>
       </w:r>
       <w:proofErr w:type="gramEnd"/>
       <w:r>
+        <w:rPr>
+          <w:rFonts w:ascii="Times New Roman" w:hAnsi="Times New Roman" w:cs="Times New Roman"/>
+          <w:sz w:val="18"/>
+          <w:szCs w:val="18"/>
+        </w:rPr>
         <w:t xml:space="preserve"> displayed.</w:t>
       </w:r>
     </w:p>
     <w:p>
       <w:pPr>
         <w:spacing w:line="480" w:lineRule="auto"/>
-      </w:pPr>
-      <w:r>
+        <w:rPr>
+          <w:rFonts w:ascii="Times New Roman" w:hAnsi="Times New Roman" w:cs="Times New Roman"/>
+          <w:sz w:val="18"/>
+          <w:szCs w:val="18"/>
+        </w:rPr>
+      </w:pPr>
+      <w:r>
+        <w:rPr>
+          <w:rFonts w:ascii="Times New Roman" w:hAnsi="Times New Roman" w:cs="Times New Roman"/>
+          <w:sz w:val="18"/>
+          <w:szCs w:val="18"/>
+        </w:rPr>
         <w:t>If the password is invalid:</w:t>
       </w:r>
     </w:p>
@@ -583,24 +1696,54 @@
           <w:numId w:val="3"/>
         </w:numPr>
         <w:spacing w:line="480" w:lineRule="auto"/>
-      </w:pPr>
-      <w:r>
+        <w:rPr>
+          <w:rFonts w:ascii="Times New Roman" w:hAnsi="Times New Roman" w:cs="Times New Roman"/>
+          <w:sz w:val="18"/>
+          <w:szCs w:val="18"/>
+        </w:rPr>
+      </w:pPr>
+      <w:r>
+        <w:rPr>
+          <w:rFonts w:ascii="Times New Roman" w:hAnsi="Times New Roman" w:cs="Times New Roman"/>
+          <w:sz w:val="18"/>
+          <w:szCs w:val="18"/>
+        </w:rPr>
         <w:t xml:space="preserve">Error </w:t>
       </w:r>
       <w:proofErr w:type="gramStart"/>
       <w:r>
+        <w:rPr>
+          <w:rFonts w:ascii="Times New Roman" w:hAnsi="Times New Roman" w:cs="Times New Roman"/>
+          <w:sz w:val="18"/>
+          <w:szCs w:val="18"/>
+        </w:rPr>
         <w:t>message is</w:t>
       </w:r>
       <w:proofErr w:type="gramEnd"/>
       <w:r>
+        <w:rPr>
+          <w:rFonts w:ascii="Times New Roman" w:hAnsi="Times New Roman" w:cs="Times New Roman"/>
+          <w:sz w:val="18"/>
+          <w:szCs w:val="18"/>
+        </w:rPr>
         <w:t xml:space="preserve"> displayed.</w:t>
       </w:r>
     </w:p>
     <w:p>
       <w:pPr>
         <w:spacing w:line="480" w:lineRule="auto"/>
-      </w:pPr>
-      <w:r>
+        <w:rPr>
+          <w:rFonts w:ascii="Times New Roman" w:hAnsi="Times New Roman" w:cs="Times New Roman"/>
+          <w:sz w:val="18"/>
+          <w:szCs w:val="18"/>
+        </w:rPr>
+      </w:pPr>
+      <w:r>
+        <w:rPr>
+          <w:rFonts w:ascii="Times New Roman" w:hAnsi="Times New Roman" w:cs="Times New Roman"/>
+          <w:sz w:val="18"/>
+          <w:szCs w:val="18"/>
+        </w:rPr>
         <w:t>If both values are valid:</w:t>
       </w:r>
     </w:p>
@@ -612,8 +1755,18 @@
           <w:numId w:val="3"/>
         </w:numPr>
         <w:spacing w:line="480" w:lineRule="auto"/>
-      </w:pPr>
-      <w:r>
+        <w:rPr>
+          <w:rFonts w:ascii="Times New Roman" w:hAnsi="Times New Roman" w:cs="Times New Roman"/>
+          <w:sz w:val="18"/>
+          <w:szCs w:val="18"/>
+        </w:rPr>
+      </w:pPr>
+      <w:r>
+        <w:rPr>
+          <w:rFonts w:ascii="Times New Roman" w:hAnsi="Times New Roman" w:cs="Times New Roman"/>
+          <w:sz w:val="18"/>
+          <w:szCs w:val="18"/>
+        </w:rPr>
         <w:t>All given data is used to create an instance/object of the class Account and is saved to the system’s database.</w:t>
       </w:r>
     </w:p>
@@ -625,8 +1778,18 @@
           <w:numId w:val="3"/>
         </w:numPr>
         <w:spacing w:line="480" w:lineRule="auto"/>
-      </w:pPr>
-      <w:r>
+        <w:rPr>
+          <w:rFonts w:ascii="Times New Roman" w:hAnsi="Times New Roman" w:cs="Times New Roman"/>
+          <w:sz w:val="18"/>
+          <w:szCs w:val="18"/>
+        </w:rPr>
+      </w:pPr>
+      <w:r>
+        <w:rPr>
+          <w:rFonts w:ascii="Times New Roman" w:hAnsi="Times New Roman" w:cs="Times New Roman"/>
+          <w:sz w:val="18"/>
+          <w:szCs w:val="18"/>
+        </w:rPr>
         <w:t>The system returns the user to the login screen.</w:t>
       </w:r>
     </w:p>
@@ -909,6 +2072,118 @@
       </w:pPr>
     </w:lvl>
   </w:abstractNum>
+  <w:abstractNum w:abstractNumId="3" w15:restartNumberingAfterBreak="0">
+    <w:nsid w:val="7E014C06"/>
+    <w:multiLevelType w:val="hybridMultilevel"/>
+    <w:tmpl w:val="84705F16"/>
+    <w:lvl w:ilvl="0" w:tplc="56903AF8">
+      <w:numFmt w:val="bullet"/>
+      <w:lvlText w:val=""/>
+      <w:lvlJc w:val="left"/>
+      <w:pPr>
+        <w:ind w:left="1800" w:hanging="360"/>
+      </w:pPr>
+      <w:rPr>
+        <w:rFonts w:ascii="Symbol" w:eastAsiaTheme="minorHAnsi" w:hAnsi="Symbol" w:cstheme="minorBidi" w:hint="default"/>
+      </w:rPr>
+    </w:lvl>
+    <w:lvl w:ilvl="1" w:tplc="04090003" w:tentative="1">
+      <w:start w:val="1"/>
+      <w:numFmt w:val="bullet"/>
+      <w:lvlText w:val="o"/>
+      <w:lvlJc w:val="left"/>
+      <w:pPr>
+        <w:ind w:left="2520" w:hanging="360"/>
+      </w:pPr>
+      <w:rPr>
+        <w:rFonts w:ascii="Courier New" w:hAnsi="Courier New" w:cs="Courier New" w:hint="default"/>
+      </w:rPr>
+    </w:lvl>
+    <w:lvl w:ilvl="2" w:tplc="04090005" w:tentative="1">
+      <w:start w:val="1"/>
+      <w:numFmt w:val="bullet"/>
+      <w:lvlText w:val=""/>
+      <w:lvlJc w:val="left"/>
+      <w:pPr>
+        <w:ind w:left="3240" w:hanging="360"/>
+      </w:pPr>
+      <w:rPr>
+        <w:rFonts w:ascii="Wingdings" w:hAnsi="Wingdings" w:hint="default"/>
+      </w:rPr>
+    </w:lvl>
+    <w:lvl w:ilvl="3" w:tplc="04090001" w:tentative="1">
+      <w:start w:val="1"/>
+      <w:numFmt w:val="bullet"/>
+      <w:lvlText w:val=""/>
+      <w:lvlJc w:val="left"/>
+      <w:pPr>
+        <w:ind w:left="3960" w:hanging="360"/>
+      </w:pPr>
+      <w:rPr>
+        <w:rFonts w:ascii="Symbol" w:hAnsi="Symbol" w:hint="default"/>
+      </w:rPr>
+    </w:lvl>
+    <w:lvl w:ilvl="4" w:tplc="04090003" w:tentative="1">
+      <w:start w:val="1"/>
+      <w:numFmt w:val="bullet"/>
+      <w:lvlText w:val="o"/>
+      <w:lvlJc w:val="left"/>
+      <w:pPr>
+        <w:ind w:left="4680" w:hanging="360"/>
+      </w:pPr>
+      <w:rPr>
+        <w:rFonts w:ascii="Courier New" w:hAnsi="Courier New" w:cs="Courier New" w:hint="default"/>
+      </w:rPr>
+    </w:lvl>
+    <w:lvl w:ilvl="5" w:tplc="04090005" w:tentative="1">
+      <w:start w:val="1"/>
+      <w:numFmt w:val="bullet"/>
+      <w:lvlText w:val=""/>
+      <w:lvlJc w:val="left"/>
+      <w:pPr>
+        <w:ind w:left="5400" w:hanging="360"/>
+      </w:pPr>
+      <w:rPr>
+        <w:rFonts w:ascii="Wingdings" w:hAnsi="Wingdings" w:hint="default"/>
+      </w:rPr>
+    </w:lvl>
+    <w:lvl w:ilvl="6" w:tplc="04090001" w:tentative="1">
+      <w:start w:val="1"/>
+      <w:numFmt w:val="bullet"/>
+      <w:lvlText w:val=""/>
+      <w:lvlJc w:val="left"/>
+      <w:pPr>
+        <w:ind w:left="6120" w:hanging="360"/>
+      </w:pPr>
+      <w:rPr>
+        <w:rFonts w:ascii="Symbol" w:hAnsi="Symbol" w:hint="default"/>
+      </w:rPr>
+    </w:lvl>
+    <w:lvl w:ilvl="7" w:tplc="04090003" w:tentative="1">
+      <w:start w:val="1"/>
+      <w:numFmt w:val="bullet"/>
+      <w:lvlText w:val="o"/>
+      <w:lvlJc w:val="left"/>
+      <w:pPr>
+        <w:ind w:left="6840" w:hanging="360"/>
+      </w:pPr>
+      <w:rPr>
+        <w:rFonts w:ascii="Courier New" w:hAnsi="Courier New" w:cs="Courier New" w:hint="default"/>
+      </w:rPr>
+    </w:lvl>
+    <w:lvl w:ilvl="8" w:tplc="04090005" w:tentative="1">
+      <w:start w:val="1"/>
+      <w:numFmt w:val="bullet"/>
+      <w:lvlText w:val=""/>
+      <w:lvlJc w:val="left"/>
+      <w:pPr>
+        <w:ind w:left="7560" w:hanging="360"/>
+      </w:pPr>
+      <w:rPr>
+        <w:rFonts w:ascii="Wingdings" w:hAnsi="Wingdings" w:hint="default"/>
+      </w:rPr>
+    </w:lvl>
+  </w:abstractNum>
   <w:num w:numId="1" w16cid:durableId="1878932398">
     <w:abstractNumId w:val="0"/>
   </w:num>
@@ -917,6 +2192,9 @@
   </w:num>
   <w:num w:numId="3" w16cid:durableId="805199316">
     <w:abstractNumId w:val="2"/>
+  </w:num>
+  <w:num w:numId="4" w16cid:durableId="61103547">
+    <w:abstractNumId w:val="3"/>
   </w:num>
 </w:numbering>
 </file>
@@ -1524,6 +2802,7 @@
   <w:style w:type="character" w:default="1" w:styleId="DefaultParagraphFont">
     <w:name w:val="Default Paragraph Font"/>
     <w:uiPriority w:val="1"/>
+    <w:semiHidden/>
     <w:unhideWhenUsed/>
   </w:style>
   <w:style w:type="table" w:default="1" w:styleId="TableNormal">

</xml_diff>